<commit_message>
Hepatology Communications: language-edit pass and rebuilt submission files
A copy-editing round across the HC manuscript and its cover letter and COI
statement: article usage, comma splices, comma-separated lists in place of
semicolons, and consistent hyphenation. No analytical content or number
changes.

The affected .docx files are rebuilt from the edited markdown by
build_submission_hc.py, which is extended here to cover the added files.
Manuscript_JTM_v1.docx and Manuscript_NCVR_v1.docx carry the same edit pass
for those two submission versions.
</commit_message>
<xml_diff>
--- a/Conflict_of_Interest_HC.docx
+++ b/Conflict_of_Interest_HC.docx
@@ -39,7 +39,7 @@
           <w:rFonts w:ascii="Times New Roman" w:hAnsi="Times New Roman"/>
           <w:color w:val="000000"/>
         </w:rPr>
-        <w:t xml:space="preserve">“Translation-related transcriptional programs in hepatocellular carcinoma: disease-context-dependent remodeling revealed by cross-disease comparison with heart failure”</w:t>
+        <w:t xml:space="preserve">“Translation-related transcriptional programs in HCC: disease-context-dependent remodeling versus heart failure”</w:t>
       </w:r>
       <w:r>
         <w:rPr>
@@ -189,7 +189,7 @@
           <w:rFonts w:ascii="Times New Roman" w:hAnsi="Times New Roman"/>
           <w:color w:val="000000"/>
         </w:rPr>
-        <w:t xml:space="preserve">Date: August 14, 2026</w:t>
+        <w:t xml:space="preserve">Date: August 16, 2026</w:t>
       </w:r>
     </w:p>
     <w:sectPr>

</xml_diff>